<commit_message>
fix(none): update cv (#2)
* feat(none): build all pages, hide work and articles

* fix(none): update cv
</commit_message>
<xml_diff>
--- a/public/harry-evans-cv.docx
+++ b/public/harry-evans-cv.docx
@@ -143,7 +143,7 @@
           <w:szCs w:val="18"/>
           <w:rtl w:val="0"/>
         </w:rPr>
-        <w:t xml:space="preserve">Harry Evans Software Ltd (17385844), £1m PI Cover, plus £1m public liability and £10m employers' liability</w:t>
+        <w:t xml:space="preserve">Harry Evans Software Ltd (17385844), £1m professional indemnity and public liability cover</w:t>
       </w:r>
     </w:p>
     <w:p>
@@ -187,7 +187,7 @@
         <w:rPr>
           <w:rtl w:val="0"/>
         </w:rPr>
-        <w:t xml:space="preserve">Senior full stack engineer specialising in TypeScript across the entire stack. I build new products from nothing to production — most recently architecting and shipping an entire marketplace platform single-handedly, and before that leading the engineering for a new enterprise application built from scratch and integrated deeply with Salesforce. Five years building production software in London, four of them at a venture-backed marketplace delivering at pace in a scaled Agile team. Available for contract engagements four days a week.</w:t>
+        <w:t xml:space="preserve">Senior full stack engineer specialising in TypeScript across the entire stack. I build new products from nothing to production, most recently architecting and shipping an entire marketplace platform single-handedly, and before that leading the engineering for an enterprise platform that launched on time and now carries over £5m of contract value a year. Five years building production software in London, four of them at a venture-backed marketplace delivering at pace in a scaled Agile team. Available for contract engagements four days a week.</w:t>
       </w:r>
     </w:p>
     <w:p>
@@ -218,19 +218,26 @@
     </w:p>
     <w:p>
       <w:pPr>
-        <w:spacing w:after="80" w:line="240" w:lineRule="auto"/>
-        <w:rPr/>
+        <w:spacing w:after="0" w:line="240" w:lineRule="auto"/>
+        <w:rPr>
+          <w:sz w:val="18"/>
+          <w:szCs w:val="18"/>
+        </w:rPr>
       </w:pPr>
       <w:r>
         <w:rPr>
           <w:b w:val="1"/>
           <w:bCs w:val="1"/>
+          <w:sz w:val="18"/>
+          <w:szCs w:val="18"/>
           <w:rtl w:val="0"/>
         </w:rPr>
         <w:t xml:space="preserve">Core </w:t>
       </w:r>
       <w:r>
         <w:rPr>
+          <w:sz w:val="18"/>
+          <w:szCs w:val="18"/>
           <w:rtl w:val="0"/>
         </w:rPr>
         <w:t xml:space="preserve">— TypeScript, JavaScript, SQL, Node.js</w:t>
@@ -239,6 +246,8 @@
         <w:rPr>
           <w:b w:val="1"/>
           <w:bCs w:val="1"/>
+          <w:sz w:val="18"/>
+          <w:szCs w:val="18"/>
           <w:rtl w:val="0"/>
         </w:rPr>
         <w:br w:type="textWrapping"/>
@@ -246,6 +255,8 @@
       </w:r>
       <w:r>
         <w:rPr>
+          <w:sz w:val="18"/>
+          <w:szCs w:val="18"/>
           <w:rtl w:val="0"/>
         </w:rPr>
         <w:t xml:space="preserve">— React, Next.js (App Router), React Query, Apollo Client, Tailwind, shadcn, CSS-in-JS (Chakra UI, Emotion, styled-components), design systems and token architecture</w:t>
@@ -254,6 +265,8 @@
         <w:rPr>
           <w:b w:val="1"/>
           <w:bCs w:val="1"/>
+          <w:sz w:val="18"/>
+          <w:szCs w:val="18"/>
           <w:rtl w:val="0"/>
         </w:rPr>
         <w:br w:type="textWrapping"/>
@@ -261,29 +274,64 @@
       </w:r>
       <w:r>
         <w:rPr>
+          <w:sz w:val="18"/>
+          <w:szCs w:val="18"/>
           <w:rtl w:val="0"/>
         </w:rPr>
         <w:t xml:space="preserve">— GraphQL (Yoga &amp; Apollo Server), Prisma, PostgreSQL, REST, Hono, Express</w:t>
       </w:r>
+    </w:p>
+    <w:p>
+      <w:pPr>
+        <w:spacing w:after="80" w:line="240" w:lineRule="auto"/>
+        <w:rPr>
+          <w:sz w:val="18"/>
+          <w:szCs w:val="18"/>
+        </w:rPr>
+      </w:pPr>
       <w:r>
         <w:rPr>
           <w:b w:val="1"/>
           <w:bCs w:val="1"/>
-          <w:rtl w:val="0"/>
-        </w:rPr>
+          <w:sz w:val="18"/>
+          <w:szCs w:val="18"/>
+          <w:rtl w:val="0"/>
+        </w:rPr>
+        <w:t xml:space="preserve">Auth —</w:t>
+      </w:r>
+      <w:r>
+        <w:rPr>
+          <w:sz w:val="18"/>
+          <w:szCs w:val="18"/>
+          <w:rtl w:val="0"/>
+        </w:rPr>
+        <w:t xml:space="preserve"> Amazon Cognito, passwordless and magic-link flows, role-based access control, OAuth token lifecycles</w:t>
         <w:br w:type="textWrapping"/>
-        <w:t xml:space="preserve">Integrations &amp; async </w:t>
-      </w:r>
-      <w:r>
-        <w:rPr>
-          <w:rtl w:val="0"/>
-        </w:rPr>
-        <w:t xml:space="preserve">— Stripe Connect, Salesforce platform events, Cal.com Platform, OAuth token lifecycles, HMAC webhook verification, idempotent event handling, Kafka, SQS, Cloud Tasks, scheduled jobs</w:t>
       </w:r>
       <w:r>
         <w:rPr>
           <w:b w:val="1"/>
           <w:bCs w:val="1"/>
+          <w:sz w:val="18"/>
+          <w:szCs w:val="18"/>
+          <w:rtl w:val="0"/>
+        </w:rPr>
+        <w:t xml:space="preserve">Integrations &amp; async </w:t>
+      </w:r>
+      <w:r>
+        <w:rPr>
+          <w:sz w:val="18"/>
+          <w:szCs w:val="18"/>
+          <w:rtl w:val="0"/>
+        </w:rPr>
+        <w:t xml:space="preserve">— Stripe Connect, Salesforce webhook replica, Cal.com Platform, HMAC webhook verification, idempotent event handling, Kafka, SQS, Cloud Tasks, scheduled jobs</w:t>
+      </w:r>
+      <w:r>
+        <w:rPr>
+          <w:b w:val="1"/>
+          <w:bCs w:val="1"/>
+          <w:sz w:val="18"/>
+          <w:szCs w:val="18"/>
           <w:rtl w:val="0"/>
         </w:rPr>
         <w:br w:type="textWrapping"/>
@@ -291,6 +339,8 @@
       </w:r>
       <w:r>
         <w:rPr>
+          <w:sz w:val="18"/>
+          <w:szCs w:val="18"/>
           <w:rtl w:val="0"/>
         </w:rPr>
         <w:t xml:space="preserve">— AWS, GCP (Cloud Run, Cloud SQL, Cloud Tasks, Secret Manager), Terraform, Docker, GitHub Actions, Turborepo monorepos, structured logging</w:t>
@@ -299,6 +349,8 @@
         <w:rPr>
           <w:b w:val="1"/>
           <w:bCs w:val="1"/>
+          <w:sz w:val="18"/>
+          <w:szCs w:val="18"/>
           <w:rtl w:val="0"/>
         </w:rPr>
         <w:br w:type="textWrapping"/>
@@ -306,6 +358,8 @@
       </w:r>
       <w:r>
         <w:rPr>
+          <w:sz w:val="18"/>
+          <w:szCs w:val="18"/>
           <w:rtl w:val="0"/>
         </w:rPr>
         <w:t xml:space="preserve">— Jest, Vitest, TDD, integration testing</w:t>
@@ -314,6 +368,8 @@
         <w:rPr>
           <w:b w:val="1"/>
           <w:bCs w:val="1"/>
+          <w:sz w:val="18"/>
+          <w:szCs w:val="18"/>
           <w:rtl w:val="0"/>
         </w:rPr>
         <w:br w:type="textWrapping"/>
@@ -321,6 +377,8 @@
       </w:r>
       <w:r>
         <w:rPr>
+          <w:sz w:val="18"/>
+          <w:szCs w:val="18"/>
           <w:rtl w:val="0"/>
         </w:rPr>
         <w:t xml:space="preserve">— Python, Go</w:t>
@@ -391,10 +449,15 @@
     <w:p>
       <w:pPr>
         <w:spacing w:after="40" w:line="240" w:lineRule="auto"/>
-        <w:rPr/>
-      </w:pPr>
-      <w:r>
-        <w:rPr>
+        <w:rPr>
+          <w:sz w:val="18"/>
+          <w:szCs w:val="18"/>
+        </w:rPr>
+      </w:pPr>
+      <w:r>
+        <w:rPr>
+          <w:sz w:val="18"/>
+          <w:szCs w:val="18"/>
           <w:rtl w:val="0"/>
         </w:rPr>
         <w:t xml:space="preserve">A marketplace connecting fashion stylists with clients, with a separate internal portal for platform operations. Sole engineer; architected and built the entire platform.</w:t>
@@ -408,12 +471,18 @@
         </w:numPr>
         <w:spacing w:after="0" w:line="240" w:lineRule="auto"/>
         <w:ind w:left="720" w:hanging="360"/>
-      </w:pPr>
-      <w:r>
-        <w:rPr>
-          <w:rtl w:val="0"/>
-        </w:rPr>
-        <w:t xml:space="preserve">Designed and shipped the full product solo — a Next.js App Router web app serving both stylists and clients, an internal operations portal, a GraphQL API, a webhooks service and a marketing site — in a Turborepo monorepo of 18 shared packages.</w:t>
+        <w:rPr>
+          <w:sz w:val="20"/>
+          <w:szCs w:val="20"/>
+        </w:rPr>
+      </w:pPr>
+      <w:r>
+        <w:rPr>
+          <w:sz w:val="18"/>
+          <w:szCs w:val="18"/>
+          <w:rtl w:val="0"/>
+        </w:rPr>
+        <w:t xml:space="preserve">Designed and shipped the full product solo - a Next.js App Router web app serving both stylists and clients, an internal operations portal, a GraphQL API, a webhooks service and a marketing site - in a Turborepo monorepo of 20 shared packages.</w:t>
       </w:r>
     </w:p>
     <w:p>
@@ -424,12 +493,18 @@
         </w:numPr>
         <w:spacing w:after="0" w:line="240" w:lineRule="auto"/>
         <w:ind w:left="720" w:hanging="360"/>
-      </w:pPr>
-      <w:r>
-        <w:rPr>
-          <w:rtl w:val="0"/>
-        </w:rPr>
-        <w:t xml:space="preserve">Built a deliberately platform-agnostic core, separating domain logic, design tokens, view-model hooks and the API layer from any UI framework, ensuring business logic can drive a React Native app without a rewrite.</w:t>
+        <w:rPr>
+          <w:sz w:val="20"/>
+          <w:szCs w:val="20"/>
+        </w:rPr>
+      </w:pPr>
+      <w:r>
+        <w:rPr>
+          <w:sz w:val="18"/>
+          <w:szCs w:val="18"/>
+          <w:rtl w:val="0"/>
+        </w:rPr>
+        <w:t xml:space="preserve">Defined the Salesforce data contract the product needed, then consumed a webhook replica over GraphQL so organisers saw live lineup progress from the CRM.</w:t>
       </w:r>
     </w:p>
     <w:p>
@@ -440,9 +515,15 @@
         </w:numPr>
         <w:spacing w:after="0" w:line="240" w:lineRule="auto"/>
         <w:ind w:left="720" w:hanging="360"/>
-      </w:pPr>
-      <w:r>
-        <w:rPr>
+        <w:rPr>
+          <w:sz w:val="20"/>
+          <w:szCs w:val="20"/>
+        </w:rPr>
+      </w:pPr>
+      <w:r>
+        <w:rPr>
+          <w:sz w:val="18"/>
+          <w:szCs w:val="18"/>
           <w:rtl w:val="0"/>
         </w:rPr>
         <w:t xml:space="preserve">Enforced architectural boundaries with a custom ESLint rule that blocks web-only imports from shared packages.</w:t>
@@ -456,9 +537,15 @@
         </w:numPr>
         <w:spacing w:after="0" w:line="240" w:lineRule="auto"/>
         <w:ind w:left="720" w:hanging="360"/>
-      </w:pPr>
-      <w:r>
-        <w:rPr>
+        <w:rPr>
+          <w:sz w:val="20"/>
+          <w:szCs w:val="20"/>
+        </w:rPr>
+      </w:pPr>
+      <w:r>
+        <w:rPr>
+          <w:sz w:val="18"/>
+          <w:szCs w:val="18"/>
           <w:rtl w:val="0"/>
         </w:rPr>
         <w:t xml:space="preserve">Implemented payments on Stripe Connect, including an idempotent payment-intent fulfilment path that handles duplicate webhook delivery and out-of-order events safely.</w:t>
@@ -472,9 +559,15 @@
         </w:numPr>
         <w:spacing w:after="0" w:line="240" w:lineRule="auto"/>
         <w:ind w:left="720" w:hanging="360"/>
-      </w:pPr>
-      <w:r>
-        <w:rPr>
+        <w:rPr>
+          <w:sz w:val="20"/>
+          <w:szCs w:val="20"/>
+        </w:rPr>
+      </w:pPr>
+      <w:r>
+        <w:rPr>
+          <w:sz w:val="18"/>
+          <w:szCs w:val="18"/>
           <w:rtl w:val="0"/>
         </w:rPr>
         <w:t xml:space="preserve">Integrated Cal.com Platform for scheduling, managing user provisioning, rotating OAuth refresh tokens, and calendar connections.</w:t>
@@ -488,9 +581,15 @@
         </w:numPr>
         <w:spacing w:after="0" w:line="240" w:lineRule="auto"/>
         <w:ind w:left="720" w:hanging="360"/>
-      </w:pPr>
-      <w:r>
-        <w:rPr>
+        <w:rPr>
+          <w:sz w:val="20"/>
+          <w:szCs w:val="20"/>
+        </w:rPr>
+      </w:pPr>
+      <w:r>
+        <w:rPr>
+          <w:sz w:val="18"/>
+          <w:szCs w:val="18"/>
           <w:rtl w:val="0"/>
         </w:rPr>
         <w:t xml:space="preserve">Built a standalone service for HMAC-verified webhook ingestion, asynchronous email dispatch through Cloud Tasks, and scheduled jobs for creator payouts and notification digests.</w:t>
@@ -504,9 +603,15 @@
         </w:numPr>
         <w:spacing w:after="0" w:line="240" w:lineRule="auto"/>
         <w:ind w:left="720" w:hanging="360"/>
-      </w:pPr>
-      <w:r>
-        <w:rPr>
+        <w:rPr>
+          <w:sz w:val="20"/>
+          <w:szCs w:val="20"/>
+        </w:rPr>
+      </w:pPr>
+      <w:r>
+        <w:rPr>
+          <w:sz w:val="18"/>
+          <w:szCs w:val="18"/>
           <w:rtl w:val="0"/>
         </w:rPr>
         <w:t xml:space="preserve">Modelled and shipped the data layer in Prisma and PostgreSQL, covering services, staged client journeys, and payment state transitions.</w:t>
@@ -520,9 +625,15 @@
         </w:numPr>
         <w:spacing w:after="0" w:line="240" w:lineRule="auto"/>
         <w:ind w:left="720" w:hanging="360"/>
-      </w:pPr>
-      <w:r>
-        <w:rPr>
+        <w:rPr>
+          <w:sz w:val="20"/>
+          <w:szCs w:val="20"/>
+        </w:rPr>
+      </w:pPr>
+      <w:r>
+        <w:rPr>
+          <w:sz w:val="18"/>
+          <w:szCs w:val="18"/>
           <w:rtl w:val="0"/>
         </w:rPr>
         <w:t xml:space="preserve">Owned all infrastructure via Terraform-provisioned GCP (Cloud Run, Cloud SQL, Secret Manager, Cloud Tasks) using Workload Identity Federation.</w:t>
@@ -536,9 +647,15 @@
         </w:numPr>
         <w:spacing w:after="0" w:line="240" w:lineRule="auto"/>
         <w:ind w:left="720" w:hanging="360"/>
-      </w:pPr>
-      <w:r>
-        <w:rPr>
+        <w:rPr>
+          <w:sz w:val="20"/>
+          <w:szCs w:val="20"/>
+        </w:rPr>
+      </w:pPr>
+      <w:r>
+        <w:rPr>
+          <w:sz w:val="18"/>
+          <w:szCs w:val="18"/>
           <w:rtl w:val="0"/>
         </w:rPr>
         <w:t xml:space="preserve">Built CI/CD pipelines in GitHub Actions with automated build/test gating and zero-touch production deployment.</w:t>
@@ -568,7 +685,7 @@
         <w:rPr>
           <w:rtl w:val="0"/>
         </w:rPr>
-        <w:t xml:space="preserve">Togather (formerly Feast It) — London</w:t>
+        <w:t xml:space="preserve">Togather (formerly Feast It)</w:t>
       </w:r>
     </w:p>
     <w:p>
@@ -584,7 +701,7 @@
           <w:szCs w:val="18"/>
           <w:rtl w:val="0"/>
         </w:rPr>
-        <w:t xml:space="preserve">December 2021 – December 2025</w:t>
+        <w:t xml:space="preserve">London | December 2021 – December 2025</w:t>
       </w:r>
       <w:r>
         <w:rPr>
@@ -616,10 +733,15 @@
     <w:p>
       <w:pPr>
         <w:spacing w:after="40" w:line="240" w:lineRule="auto"/>
-        <w:rPr/>
-      </w:pPr>
-      <w:r>
-        <w:rPr>
+        <w:rPr>
+          <w:sz w:val="18"/>
+          <w:szCs w:val="18"/>
+        </w:rPr>
+      </w:pPr>
+      <w:r>
+        <w:rPr>
+          <w:sz w:val="18"/>
+          <w:szCs w:val="18"/>
           <w:rtl w:val="0"/>
         </w:rPr>
         <w:t xml:space="preserve">Venture-backed events and catering marketplace. Progressed from a temporary internship to Senior Engineer over four years.</w:t>
@@ -633,12 +755,18 @@
         </w:numPr>
         <w:spacing w:after="0" w:line="240" w:lineRule="auto"/>
         <w:ind w:left="720" w:hanging="360"/>
-      </w:pPr>
-      <w:r>
-        <w:rPr>
-          <w:rtl w:val="0"/>
-        </w:rPr>
-        <w:t xml:space="preserve">Headed the engineering solution for a new enterprise application built from scratch for corporate clients, integrating it deeply with Salesforce via platform events.</w:t>
+        <w:rPr>
+          <w:sz w:val="20"/>
+          <w:szCs w:val="20"/>
+        </w:rPr>
+      </w:pPr>
+      <w:r>
+        <w:rPr>
+          <w:sz w:val="18"/>
+          <w:szCs w:val="18"/>
+          <w:rtl w:val="0"/>
+        </w:rPr>
+        <w:t xml:space="preserve">Led the engineering for a new enterprise application, built from scratch to give the corporate clients and public events side of the business a dedicated platform of its own. It now carries contracts for more than 30 festivals and public events worth over £5m a year, and is still growing. Directed three to four engineers under the squad's lead engineer and launched on time in October 2025, four months from a standing start.</w:t>
       </w:r>
     </w:p>
     <w:p>
@@ -649,12 +777,18 @@
         </w:numPr>
         <w:spacing w:after="0" w:line="240" w:lineRule="auto"/>
         <w:ind w:left="720" w:hanging="360"/>
-      </w:pPr>
-      <w:r>
-        <w:rPr>
-          <w:rtl w:val="0"/>
-        </w:rPr>
-        <w:t xml:space="preserve">Part of the small team that delivered the largest rework of the platform's quoting system in company history.</w:t>
+        <w:rPr>
+          <w:sz w:val="20"/>
+          <w:szCs w:val="20"/>
+        </w:rPr>
+      </w:pPr>
+      <w:r>
+        <w:rPr>
+          <w:sz w:val="18"/>
+          <w:szCs w:val="18"/>
+          <w:rtl w:val="0"/>
+        </w:rPr>
+        <w:t xml:space="preserve">Designed its GraphQL schema and multi-tenant permission model from scratch — each client's production team scoped to its own contract, with internal staff working across every account — behind a Next.js App Router front end with passwordless authentication on Amazon Cognito</w:t>
       </w:r>
     </w:p>
     <w:p>
@@ -665,12 +799,18 @@
         </w:numPr>
         <w:spacing w:after="0" w:line="240" w:lineRule="auto"/>
         <w:ind w:left="720" w:hanging="360"/>
-      </w:pPr>
-      <w:r>
-        <w:rPr>
-          <w:rtl w:val="0"/>
-        </w:rPr>
-        <w:t xml:space="preserve">Served as de facto second in command of the Conversion squad, owning release velocity and representing engineering in company-wide forums.</w:t>
+        <w:rPr>
+          <w:sz w:val="20"/>
+          <w:szCs w:val="20"/>
+        </w:rPr>
+      </w:pPr>
+      <w:r>
+        <w:rPr>
+          <w:sz w:val="18"/>
+          <w:szCs w:val="18"/>
+          <w:rtl w:val="0"/>
+        </w:rPr>
+        <w:t xml:space="preserve">Built the bidirectional Salesforce integration: consuming platform events into our own database to surface in the application, and pushing supplier actions taken in the core marketplace back into Salesforce</w:t>
       </w:r>
     </w:p>
     <w:p>
@@ -681,12 +821,18 @@
         </w:numPr>
         <w:spacing w:after="0" w:line="240" w:lineRule="auto"/>
         <w:ind w:left="720" w:hanging="360"/>
-      </w:pPr>
-      <w:r>
-        <w:rPr>
-          <w:rtl w:val="0"/>
-        </w:rPr>
-        <w:t xml:space="preserve">Delivered 60% above the engineering average on story points and ranked in the 90th percentile for peer reviews completed department-wide.</w:t>
+        <w:rPr>
+          <w:sz w:val="20"/>
+          <w:szCs w:val="20"/>
+        </w:rPr>
+      </w:pPr>
+      <w:r>
+        <w:rPr>
+          <w:sz w:val="18"/>
+          <w:szCs w:val="18"/>
+          <w:rtl w:val="0"/>
+        </w:rPr>
+        <w:t xml:space="preserve">Part of the small team that delivered the largest rework of the platform's quoting system in company history.</w:t>
       </w:r>
     </w:p>
     <w:p>
@@ -697,12 +843,18 @@
         </w:numPr>
         <w:spacing w:after="0" w:line="240" w:lineRule="auto"/>
         <w:ind w:left="720" w:hanging="360"/>
-      </w:pPr>
-      <w:r>
-        <w:rPr>
-          <w:rtl w:val="0"/>
-        </w:rPr>
-        <w:t xml:space="preserve">Built internal npm libraries and template repositories to standardise service scaffolding, testing, and deployment across squads.</w:t>
+        <w:rPr>
+          <w:sz w:val="20"/>
+          <w:szCs w:val="20"/>
+        </w:rPr>
+      </w:pPr>
+      <w:r>
+        <w:rPr>
+          <w:sz w:val="18"/>
+          <w:szCs w:val="18"/>
+          <w:rtl w:val="0"/>
+        </w:rPr>
+        <w:t xml:space="preserve">Served as de facto second in command of the Conversion squad, owning release velocity and representing engineering in company-wide forums.</w:t>
       </w:r>
     </w:p>
     <w:p>
@@ -713,12 +865,18 @@
         </w:numPr>
         <w:spacing w:after="0" w:line="240" w:lineRule="auto"/>
         <w:ind w:left="720" w:hanging="360"/>
-      </w:pPr>
-      <w:r>
-        <w:rPr>
-          <w:rtl w:val="0"/>
-        </w:rPr>
-        <w:t xml:space="preserve">Scoped and delivered the venues marketplace as a Junior, opening a new revenue category for the business.</w:t>
+        <w:rPr>
+          <w:sz w:val="20"/>
+          <w:szCs w:val="20"/>
+        </w:rPr>
+      </w:pPr>
+      <w:r>
+        <w:rPr>
+          <w:sz w:val="18"/>
+          <w:szCs w:val="18"/>
+          <w:rtl w:val="0"/>
+        </w:rPr>
+        <w:t xml:space="preserve">Delivered 60% above the engineering average on story points and ranked in the 90th percentile for peer reviews completed department-wide.</w:t>
       </w:r>
     </w:p>
     <w:p>
@@ -729,9 +887,59 @@
         </w:numPr>
         <w:spacing w:after="0" w:line="240" w:lineRule="auto"/>
         <w:ind w:left="720" w:hanging="360"/>
-      </w:pPr>
-      <w:r>
-        <w:rPr>
+        <w:rPr>
+          <w:sz w:val="20"/>
+          <w:szCs w:val="20"/>
+        </w:rPr>
+      </w:pPr>
+      <w:r>
+        <w:rPr>
+          <w:sz w:val="18"/>
+          <w:szCs w:val="18"/>
+          <w:rtl w:val="0"/>
+        </w:rPr>
+        <w:t xml:space="preserve">Built internal npm libraries and template repositories to standardise service scaffolding, testing, and deployment across squads.</w:t>
+      </w:r>
+    </w:p>
+    <w:p>
+      <w:pPr>
+        <w:numPr>
+          <w:ilvl w:val="0"/>
+          <w:numId w:val="1"/>
+        </w:numPr>
+        <w:spacing w:after="0" w:line="240" w:lineRule="auto"/>
+        <w:ind w:left="720" w:hanging="360"/>
+        <w:rPr>
+          <w:sz w:val="20"/>
+          <w:szCs w:val="20"/>
+        </w:rPr>
+      </w:pPr>
+      <w:r>
+        <w:rPr>
+          <w:sz w:val="18"/>
+          <w:szCs w:val="18"/>
+          <w:rtl w:val="0"/>
+        </w:rPr>
+        <w:t xml:space="preserve">Scoped and delivered the venues marketplace as a Junior, opening a new revenue category for the business.</w:t>
+      </w:r>
+    </w:p>
+    <w:p>
+      <w:pPr>
+        <w:numPr>
+          <w:ilvl w:val="0"/>
+          <w:numId w:val="1"/>
+        </w:numPr>
+        <w:spacing w:after="0" w:line="240" w:lineRule="auto"/>
+        <w:ind w:left="720" w:hanging="360"/>
+        <w:rPr>
+          <w:sz w:val="20"/>
+          <w:szCs w:val="20"/>
+        </w:rPr>
+      </w:pPr>
+      <w:r>
+        <w:rPr>
+          <w:sz w:val="18"/>
+          <w:szCs w:val="18"/>
           <w:rtl w:val="0"/>
         </w:rPr>
         <w:t xml:space="preserve">Worked daily across an event-driven stack featuring React, TypeScript, Node.js, PostgreSQL, Kafka, and SQS.</w:t>

</xml_diff>

<commit_message>
fix(none): availability updated (#3)
</commit_message>
<xml_diff>
--- a/public/harry-evans-cv.docx
+++ b/public/harry-evans-cv.docx
@@ -121,7 +121,7 @@
           <w:szCs w:val="18"/>
           <w:rtl w:val="0"/>
         </w:rPr>
-        <w:t xml:space="preserve">Available 1 Sept 2026 | 4-day week | £600/day | Outside IR35 | London Hybrid/Remote</w:t>
+        <w:t xml:space="preserve">Available now | Fractional or full-time | £600/day | Outside IR35 | London Hybrid/Remote</w:t>
       </w:r>
     </w:p>
     <w:p>
@@ -187,7 +187,7 @@
         <w:rPr>
           <w:rtl w:val="0"/>
         </w:rPr>
-        <w:t xml:space="preserve">Senior full stack engineer specialising in TypeScript across the entire stack. I build new products from nothing to production, most recently architecting and shipping an entire marketplace platform single-handedly, and before that leading the engineering for an enterprise platform that launched on time and now carries over £5m of contract value a year. Five years building production software in London, four of them at a venture-backed marketplace delivering at pace in a scaled Agile team. Available for contract engagements four days a week.</w:t>
+        <w:t xml:space="preserve">Senior full stack engineer specialising in TypeScript across the entire stack. I build new products from nothing to production, most recently architecting and shipping an entire marketplace platform single-handedly, and before that leading the engineering for an enterprise platform that launched on time and now carries over £5m of contract value a year. Five years building production software in London, four of them at a venture-backed marketplace delivering at pace in a scaled Agile team. Available now for fractional or full-time contract engagements.</w:t>
       </w:r>
     </w:p>
     <w:p>

</xml_diff>